<commit_message>
Report II: map each CAPP topic to the project
Row 4 is now a table of CAPP topic, where it lives in the app and how it
is applied, covering Units 1-3. Other rows are tightened and updated for
the redesigned app so the report stays at 3 pages.

Co-Authored-By: Claude Opus 5.5 <noreply@anthropic.com>
Claude-Session: https://claude.ai/code/session_017wcUNfu8yCANjAxqyNxDAb
</commit_message>
<xml_diff>
--- a/reports/CAPP_PBL_Progress_Report_II.docx
+++ b/reports/CAPP_PBL_Progress_Report_II.docx
@@ -2373,7 +2373,7 @@
                 <w:sz w:val="19"/>
                 <w:szCs w:val="19"/>
               </w:rPr>
-              <w:t xml:space="preserve">Completed every action planned in Report I: finalised the requirements and features, prepared the flowchart and design, built the data/system structure, applied the Unit 3 concepts, and started implementation.</w:t>
+              <w:t xml:space="preserve">Completed every action planned in Report I: requirements, flowchart and design, data structure, Unit 3 study, and implementation.</w:t>
             </w:r>
           </w:p>
           <w:p>
@@ -2392,7 +2392,7 @@
                 <w:sz w:val="19"/>
                 <w:szCs w:val="19"/>
               </w:rPr>
-              <w:t xml:space="preserve">Went beyond the plan: the system is now a working web app, hosted on GitHub Pages, with a separate lab page for each CAPP unit for the review.</w:t>
+              <w:t xml:space="preserve">Went beyond the plan: the system is now a working web app on GitHub Pages, and each CAPP topic is mapped to a feature of it (row 4).</w:t>
             </w:r>
           </w:p>
         </w:tc>
@@ -2478,7 +2478,7 @@
                 <w:sz w:val="19"/>
                 <w:szCs w:val="19"/>
               </w:rPr>
-              <w:t xml:space="preserve"> 10 sample medicines (analgesic, antibiotic, insulin, vaccine, etc.) with batch, units, pack size, reorder level, unit price, expiry, supplier, and Rx/cold-storage flags. Data file: </w:t>
+              <w:t xml:space="preserve"> 10 sample medicines with batch, units, pack size, reorder level, unit price, expiry, supplier, and Rx/cold-storage flags (</w:t>
             </w:r>
             <w:hyperlink w:history="1" r:id="rIdCapp1">
               <w:r>
@@ -2498,7 +2498,7 @@
                 <w:sz w:val="19"/>
                 <w:szCs w:val="19"/>
               </w:rPr>
-              <w:t xml:space="preserve">.</w:t>
+              <w:t xml:space="preserve">).</w:t>
             </w:r>
           </w:p>
           <w:p>
@@ -2527,7 +2527,7 @@
                 <w:sz w:val="19"/>
                 <w:szCs w:val="19"/>
               </w:rPr>
-              <w:t xml:space="preserve"> Dr. Amrita Bhatnagar’s class notes and PPTs for Units 2 and 3; M. Morris Mano, </w:t>
+              <w:t xml:space="preserve"> Dr. Amrita Bhatnagar’s class notes and PPTs for Units 2 and 3; Mano, </w:t>
             </w:r>
             <w:r>
               <w:rPr>
@@ -2545,7 +2545,7 @@
                 <w:sz w:val="19"/>
                 <w:szCs w:val="19"/>
               </w:rPr>
-              <w:t xml:space="preserve">; W. Stallings, </w:t>
+              <w:t xml:space="preserve">; Stallings, </w:t>
             </w:r>
             <w:r>
               <w:rPr>
@@ -2563,7 +2563,7 @@
                 <w:sz w:val="19"/>
                 <w:szCs w:val="19"/>
               </w:rPr>
-              <w:t xml:space="preserve">; C. Hamacher, </w:t>
+              <w:t xml:space="preserve">; Hamacher, </w:t>
             </w:r>
             <w:r>
               <w:rPr>
@@ -2581,18 +2581,33 @@
                 <w:sz w:val="19"/>
                 <w:szCs w:val="19"/>
               </w:rPr>
-              <w:t xml:space="preserve">.</w:t>
-            </w:r>
-          </w:p>
-          <w:p>
-            <w:pPr>
-              <w:pStyle w:val="ListParagraph"/>
-              <w:numPr>
-                <w:ilvl w:val="0"/>
-                <w:numId w:val="2"/>
-              </w:numPr>
-              <w:spacing w:after="20" w:line="235"/>
-              <w:jc w:val="both"/>
+              <w:t xml:space="preserve">; IEEE Std 754-2019; Booth (1951); Flynn (1966).</w:t>
+            </w:r>
+          </w:p>
+        </w:tc>
+      </w:tr>
+      <w:tr>
+        <w:tc>
+          <w:tcPr>
+            <w:tcW w:type="dxa" w:w="1900"/>
+            <w:tcBorders>
+              <w:top w:val="single" w:color="000000" w:sz="4"/>
+              <w:left w:val="single" w:color="000000" w:sz="4"/>
+              <w:bottom w:val="single" w:color="000000" w:sz="4"/>
+              <w:right w:val="single" w:color="000000" w:sz="4"/>
+            </w:tcBorders>
+            <w:tcMar>
+              <w:top w:type="dxa" w:w="40"/>
+              <w:left w:type="dxa" w:w="90"/>
+              <w:bottom w:type="dxa" w:w="40"/>
+              <w:right w:type="dxa" w:w="90"/>
+            </w:tcMar>
+            <w:vAlign w:val="top"/>
+          </w:tcPr>
+          <w:p>
+            <w:pPr>
+              <w:spacing w:after="30" w:before="0" w:line="235"/>
+              <w:jc w:val="left"/>
             </w:pPr>
             <w:r>
               <w:rPr>
@@ -2602,90 +2617,7 @@
                 <w:sz w:val="19"/>
                 <w:szCs w:val="19"/>
               </w:rPr>
-              <w:t xml:space="preserve">Standards / papers:</w:t>
-            </w:r>
-            <w:r>
-              <w:rPr>
-                <w:rFonts w:ascii="Times New Roman" w:cs="Times New Roman" w:eastAsia="Times New Roman" w:hAnsi="Times New Roman"/>
-                <w:sz w:val="19"/>
-                <w:szCs w:val="19"/>
-              </w:rPr>
-              <w:t xml:space="preserve"> IEEE Std 754-2019 (floating point arithmetic); Booth (1951), A signed binary multiplication technique, </w:t>
-            </w:r>
-            <w:r>
-              <w:rPr>
-                <w:rFonts w:ascii="Times New Roman" w:cs="Times New Roman" w:eastAsia="Times New Roman" w:hAnsi="Times New Roman"/>
-                <w:i/>
-                <w:iCs/>
-                <w:sz w:val="19"/>
-                <w:szCs w:val="19"/>
-              </w:rPr>
-              <w:t xml:space="preserve">Q. J. Mech. Appl. Math.</w:t>
-            </w:r>
-            <w:r>
-              <w:rPr>
-                <w:rFonts w:ascii="Times New Roman" w:cs="Times New Roman" w:eastAsia="Times New Roman" w:hAnsi="Times New Roman"/>
-                <w:sz w:val="19"/>
-                <w:szCs w:val="19"/>
-              </w:rPr>
-              <w:t xml:space="preserve"> 4(2) – Booth’s algorithm; Flynn (1966), Very high-speed computing systems, </w:t>
-            </w:r>
-            <w:r>
-              <w:rPr>
-                <w:rFonts w:ascii="Times New Roman" w:cs="Times New Roman" w:eastAsia="Times New Roman" w:hAnsi="Times New Roman"/>
-                <w:i/>
-                <w:iCs/>
-                <w:sz w:val="19"/>
-                <w:szCs w:val="19"/>
-              </w:rPr>
-              <w:t xml:space="preserve">Proc. IEEE</w:t>
-            </w:r>
-            <w:r>
-              <w:rPr>
-                <w:rFonts w:ascii="Times New Roman" w:cs="Times New Roman" w:eastAsia="Times New Roman" w:hAnsi="Times New Roman"/>
-                <w:sz w:val="19"/>
-                <w:szCs w:val="19"/>
-              </w:rPr>
-              <w:t xml:space="preserve"> 54(12) – Flynn’s classification.</w:t>
-            </w:r>
-          </w:p>
-        </w:tc>
-      </w:tr>
-      <w:tr>
-        <w:trPr>
-          <w:cantSplit/>
-        </w:trPr>
-        <w:tc>
-          <w:tcPr>
-            <w:tcW w:type="dxa" w:w="1900"/>
-            <w:tcBorders>
-              <w:top w:val="single" w:color="000000" w:sz="4"/>
-              <w:left w:val="single" w:color="000000" w:sz="4"/>
-              <w:bottom w:val="single" w:color="000000" w:sz="4"/>
-              <w:right w:val="single" w:color="000000" w:sz="4"/>
-            </w:tcBorders>
-            <w:tcMar>
-              <w:top w:type="dxa" w:w="40"/>
-              <w:left w:type="dxa" w:w="90"/>
-              <w:bottom w:type="dxa" w:w="40"/>
-              <w:right w:type="dxa" w:w="90"/>
-            </w:tcMar>
-            <w:vAlign w:val="top"/>
-          </w:tcPr>
-          <w:p>
-            <w:pPr>
-              <w:spacing w:after="30" w:before="0" w:line="235"/>
-              <w:jc w:val="left"/>
-            </w:pPr>
-            <w:r>
-              <w:rPr>
-                <w:rFonts w:ascii="Times New Roman" w:cs="Times New Roman" w:eastAsia="Times New Roman" w:hAnsi="Times New Roman"/>
-                <w:b/>
-                <w:bCs/>
-                <w:sz w:val="19"/>
-                <w:szCs w:val="19"/>
-              </w:rPr>
-              <w:t xml:space="preserve">4. Unit/Module Concepts Applied</w:t>
+              <w:t xml:space="preserve">4. CAPP Topics Mapped to the Project</w:t>
             </w:r>
           </w:p>
         </w:tc>
@@ -2719,8 +2651,9 @@
               </w:tblBorders>
             </w:tblPr>
             <w:tblGrid>
-              <w:gridCol w:w="2000"/>
-              <w:gridCol w:w="5960"/>
+              <w:gridCol w:w="1700"/>
+              <w:gridCol w:w="1750"/>
+              <w:gridCol w:w="4510"/>
             </w:tblGrid>
             <w:tr>
               <w:trPr>
@@ -2728,7 +2661,7 @@
               </w:trPr>
               <w:tc>
                 <w:tcPr>
-                  <w:tcW w:type="dxa" w:w="2000"/>
+                  <w:tcW w:type="dxa" w:w="1700"/>
                   <w:tcBorders>
                     <w:top w:val="single" w:color="000000" w:sz="4"/>
                     <w:left w:val="single" w:color="000000" w:sz="4"/>
@@ -2757,13 +2690,48 @@
                       <w:sz w:val="18"/>
                       <w:szCs w:val="18"/>
                     </w:rPr>
-                    <w:t xml:space="preserve">Concept</w:t>
-                  </w:r>
-                </w:p>
-              </w:tc>
-              <w:tc>
-                <w:tcPr>
-                  <w:tcW w:type="dxa" w:w="5960"/>
+                    <w:t xml:space="preserve">CAPP topic</w:t>
+                  </w:r>
+                </w:p>
+              </w:tc>
+              <w:tc>
+                <w:tcPr>
+                  <w:tcW w:type="dxa" w:w="1750"/>
+                  <w:tcBorders>
+                    <w:top w:val="single" w:color="000000" w:sz="4"/>
+                    <w:left w:val="single" w:color="000000" w:sz="4"/>
+                    <w:bottom w:val="single" w:color="000000" w:sz="4"/>
+                    <w:right w:val="single" w:color="000000" w:sz="4"/>
+                  </w:tcBorders>
+                  <w:shd w:fill="D9D9D9" w:color="auto" w:val="clear"/>
+                  <w:tcMar>
+                    <w:top w:type="dxa" w:w="40"/>
+                    <w:left w:type="dxa" w:w="90"/>
+                    <w:bottom w:type="dxa" w:w="40"/>
+                    <w:right w:type="dxa" w:w="90"/>
+                  </w:tcMar>
+                  <w:vAlign w:val="top"/>
+                </w:tcPr>
+                <w:p>
+                  <w:pPr>
+                    <w:spacing w:after="0" w:line="240"/>
+                    <w:jc w:val="left"/>
+                  </w:pPr>
+                  <w:r>
+                    <w:rPr>
+                      <w:rFonts w:ascii="Times New Roman" w:cs="Times New Roman" w:eastAsia="Times New Roman" w:hAnsi="Times New Roman"/>
+                      <w:b/>
+                      <w:bCs/>
+                      <w:sz w:val="18"/>
+                      <w:szCs w:val="18"/>
+                    </w:rPr>
+                    <w:t xml:space="preserve">Where in our project</w:t>
+                  </w:r>
+                </w:p>
+              </w:tc>
+              <w:tc>
+                <w:tcPr>
+                  <w:tcW w:type="dxa" w:w="4510"/>
                   <w:tcBorders>
                     <w:top w:val="single" w:color="000000" w:sz="4"/>
                     <w:left w:val="single" w:color="000000" w:sz="4"/>
@@ -2803,7 +2771,7 @@
               </w:trPr>
               <w:tc>
                 <w:tcPr>
-                  <w:tcW w:type="dxa" w:w="2000"/>
+                  <w:tcW w:type="dxa" w:w="1700"/>
                   <w:tcBorders>
                     <w:top w:val="single" w:color="000000" w:sz="4"/>
                     <w:left w:val="single" w:color="000000" w:sz="4"/>
@@ -2831,13 +2799,13 @@
                       <w:sz w:val="18"/>
                       <w:szCs w:val="18"/>
                     </w:rPr>
-                    <w:t xml:space="preserve">Division (U2)</w:t>
-                  </w:r>
-                </w:p>
-              </w:tc>
-              <w:tc>
-                <w:tcPr>
-                  <w:tcW w:type="dxa" w:w="5960"/>
+                    <w:t xml:space="preserve">Registers, transfers, addressing (U1)</w:t>
+                  </w:r>
+                </w:p>
+              </w:tc>
+              <w:tc>
+                <w:tcPr>
+                  <w:tcW w:type="dxa" w:w="1750"/>
                   <w:tcBorders>
                     <w:top w:val="single" w:color="000000" w:sz="4"/>
                     <w:left w:val="single" w:color="000000" w:sz="4"/>
@@ -2865,7 +2833,41 @@
                       <w:sz w:val="18"/>
                       <w:szCs w:val="18"/>
                     </w:rPr>
-                    <w:t xml:space="preserve">Restoring and non-restoring division turn loose tablets into packs (quotient) and loose tablets (remainder), e.g. 157 ÷ 10 = 15 strips + 7.</w:t>
+                    <w:t xml:space="preserve">Lab › Instruction cycle</w:t>
+                  </w:r>
+                </w:p>
+              </w:tc>
+              <w:tc>
+                <w:tcPr>
+                  <w:tcW w:type="dxa" w:w="4510"/>
+                  <w:tcBorders>
+                    <w:top w:val="single" w:color="000000" w:sz="4"/>
+                    <w:left w:val="single" w:color="000000" w:sz="4"/>
+                    <w:bottom w:val="single" w:color="000000" w:sz="4"/>
+                    <w:right w:val="single" w:color="000000" w:sz="4"/>
+                  </w:tcBorders>
+                  <w:tcMar>
+                    <w:top w:type="dxa" w:w="40"/>
+                    <w:left w:type="dxa" w:w="90"/>
+                    <w:bottom w:type="dxa" w:w="40"/>
+                    <w:right w:type="dxa" w:w="90"/>
+                  </w:tcMar>
+                  <w:vAlign w:val="top"/>
+                </w:tcPr>
+                <w:p>
+                  <w:pPr>
+                    <w:spacing w:after="0" w:line="240"/>
+                    <w:jc w:val="left"/>
+                  </w:pPr>
+                  <w:r>
+                    <w:rPr>
+                      <w:rFonts w:ascii="Times New Roman" w:cs="Times New Roman" w:eastAsia="Times New Roman" w:hAnsi="Times New Roman"/>
+                      <w:b w:val="false"/>
+                      <w:bCs w:val="false"/>
+                      <w:sz w:val="18"/>
+                      <w:szCs w:val="18"/>
+                    </w:rPr>
+                    <w:t xml:space="preserve">PharmaCPU uses PC, IR, MAR, MBR and R0–R7. It addresses inventory records in memory by immediate, direct, register and base + displacement modes.</w:t>
                   </w:r>
                 </w:p>
               </w:tc>
@@ -2876,7 +2878,7 @@
               </w:trPr>
               <w:tc>
                 <w:tcPr>
-                  <w:tcW w:type="dxa" w:w="2000"/>
+                  <w:tcW w:type="dxa" w:w="1700"/>
                   <w:tcBorders>
                     <w:top w:val="single" w:color="000000" w:sz="4"/>
                     <w:left w:val="single" w:color="000000" w:sz="4"/>
@@ -2904,13 +2906,13 @@
                       <w:sz w:val="18"/>
                       <w:szCs w:val="18"/>
                     </w:rPr>
-                    <w:t xml:space="preserve">Logic operations (U2)</w:t>
-                  </w:r>
-                </w:p>
-              </w:tc>
-              <w:tc>
-                <w:tcPr>
-                  <w:tcW w:type="dxa" w:w="5960"/>
+                    <w:t xml:space="preserve">ALU design (U2)</w:t>
+                  </w:r>
+                </w:p>
+              </w:tc>
+              <w:tc>
+                <w:tcPr>
+                  <w:tcW w:type="dxa" w:w="1750"/>
                   <w:tcBorders>
                     <w:top w:val="single" w:color="000000" w:sz="4"/>
                     <w:left w:val="single" w:color="000000" w:sz="4"/>
@@ -2938,7 +2940,41 @@
                       <w:sz w:val="18"/>
                       <w:szCs w:val="18"/>
                     </w:rPr>
-                    <w:t xml:space="preserve">An 8-bit status register per medicine (Low, Out, Expiring, Expired, Rx, Cold, High value). OR sets bits; an AND mask raises alerts and filters the list.</w:t>
+                    <w:t xml:space="preserve">Stock › Sell, Restock; Lab › ALU</w:t>
+                  </w:r>
+                </w:p>
+              </w:tc>
+              <w:tc>
+                <w:tcPr>
+                  <w:tcW w:type="dxa" w:w="4510"/>
+                  <w:tcBorders>
+                    <w:top w:val="single" w:color="000000" w:sz="4"/>
+                    <w:left w:val="single" w:color="000000" w:sz="4"/>
+                    <w:bottom w:val="single" w:color="000000" w:sz="4"/>
+                    <w:right w:val="single" w:color="000000" w:sz="4"/>
+                  </w:tcBorders>
+                  <w:tcMar>
+                    <w:top w:type="dxa" w:w="40"/>
+                    <w:left w:type="dxa" w:w="90"/>
+                    <w:bottom w:type="dxa" w:w="40"/>
+                    <w:right w:type="dxa" w:w="90"/>
+                  </w:tcMar>
+                  <w:vAlign w:val="top"/>
+                </w:tcPr>
+                <w:p>
+                  <w:pPr>
+                    <w:spacing w:after="0" w:line="240"/>
+                    <w:jc w:val="left"/>
+                  </w:pPr>
+                  <w:r>
+                    <w:rPr>
+                      <w:rFonts w:ascii="Times New Roman" w:cs="Times New Roman" w:eastAsia="Times New Roman" w:hAnsi="Times New Roman"/>
+                      <w:b w:val="false"/>
+                      <w:bCs w:val="false"/>
+                      <w:sz w:val="18"/>
+                      <w:szCs w:val="18"/>
+                    </w:rPr>
+                    <w:t xml:space="preserve">A sale runs SUB stock, sold and a restock runs ADD on an 8-bit ALU with S2 S1 S0 select. A borrow (C = 0) refuses the sale.</w:t>
                   </w:r>
                 </w:p>
               </w:tc>
@@ -2949,7 +2985,7 @@
               </w:trPr>
               <w:tc>
                 <w:tcPr>
-                  <w:tcW w:type="dxa" w:w="2000"/>
+                  <w:tcW w:type="dxa" w:w="1700"/>
                   <w:tcBorders>
                     <w:top w:val="single" w:color="000000" w:sz="4"/>
                     <w:left w:val="single" w:color="000000" w:sz="4"/>
@@ -2977,13 +3013,13 @@
                       <w:sz w:val="18"/>
                       <w:szCs w:val="18"/>
                     </w:rPr>
-                    <w:t xml:space="preserve">ALU design (U2)</w:t>
-                  </w:r>
-                </w:p>
-              </w:tc>
-              <w:tc>
-                <w:tcPr>
-                  <w:tcW w:type="dxa" w:w="5960"/>
+                    <w:t xml:space="preserve">Division (U2)</w:t>
+                  </w:r>
+                </w:p>
+              </w:tc>
+              <w:tc>
+                <w:tcPr>
+                  <w:tcW w:type="dxa" w:w="1750"/>
                   <w:tcBorders>
                     <w:top w:val="single" w:color="000000" w:sz="4"/>
                     <w:left w:val="single" w:color="000000" w:sz="4"/>
@@ -3011,7 +3047,41 @@
                       <w:sz w:val="18"/>
                       <w:szCs w:val="18"/>
                     </w:rPr>
-                    <w:t xml:space="preserve">8-bit ALU with S2 S1 S0 select and C/Z/N/V flags. Sale = SUB, purchase = ADD; a borrow (C = 0) blocks overselling.</w:t>
+                    <w:t xml:space="preserve">Stock › Packs; Lab › Division</w:t>
+                  </w:r>
+                </w:p>
+              </w:tc>
+              <w:tc>
+                <w:tcPr>
+                  <w:tcW w:type="dxa" w:w="4510"/>
+                  <w:tcBorders>
+                    <w:top w:val="single" w:color="000000" w:sz="4"/>
+                    <w:left w:val="single" w:color="000000" w:sz="4"/>
+                    <w:bottom w:val="single" w:color="000000" w:sz="4"/>
+                    <w:right w:val="single" w:color="000000" w:sz="4"/>
+                  </w:tcBorders>
+                  <w:tcMar>
+                    <w:top w:type="dxa" w:w="40"/>
+                    <w:left w:type="dxa" w:w="90"/>
+                    <w:bottom w:type="dxa" w:w="40"/>
+                    <w:right w:type="dxa" w:w="90"/>
+                  </w:tcMar>
+                  <w:vAlign w:val="top"/>
+                </w:tcPr>
+                <w:p>
+                  <w:pPr>
+                    <w:spacing w:after="0" w:line="240"/>
+                    <w:jc w:val="left"/>
+                  </w:pPr>
+                  <w:r>
+                    <w:rPr>
+                      <w:rFonts w:ascii="Times New Roman" w:cs="Times New Roman" w:eastAsia="Times New Roman" w:hAnsi="Times New Roman"/>
+                      <w:b w:val="false"/>
+                      <w:bCs w:val="false"/>
+                      <w:sz w:val="18"/>
+                      <w:szCs w:val="18"/>
+                    </w:rPr>
+                    <w:t xml:space="preserve">Restoring and non-restoring division split loose tablets into full packs and loose tablets: 157 ÷ 10 = 15 packs + 7.</w:t>
                   </w:r>
                 </w:p>
               </w:tc>
@@ -3022,7 +3092,7 @@
               </w:trPr>
               <w:tc>
                 <w:tcPr>
-                  <w:tcW w:type="dxa" w:w="2000"/>
+                  <w:tcW w:type="dxa" w:w="1700"/>
                   <w:tcBorders>
                     <w:top w:val="single" w:color="000000" w:sz="4"/>
                     <w:left w:val="single" w:color="000000" w:sz="4"/>
@@ -3050,13 +3120,13 @@
                       <w:sz w:val="18"/>
                       <w:szCs w:val="18"/>
                     </w:rPr>
-                    <w:t xml:space="preserve">IEEE 754, FP arithmetic (U2)</w:t>
-                  </w:r>
-                </w:p>
-              </w:tc>
-              <w:tc>
-                <w:tcPr>
-                  <w:tcW w:type="dxa" w:w="5960"/>
+                    <w:t xml:space="preserve">Logic operations (U2)</w:t>
+                  </w:r>
+                </w:p>
+              </w:tc>
+              <w:tc>
+                <w:tcPr>
+                  <w:tcW w:type="dxa" w:w="1750"/>
                   <w:tcBorders>
                     <w:top w:val="single" w:color="000000" w:sz="4"/>
                     <w:left w:val="single" w:color="000000" w:sz="4"/>
@@ -3084,7 +3154,41 @@
                       <w:sz w:val="18"/>
                       <w:szCs w:val="18"/>
                     </w:rPr>
-                    <w:t xml:space="preserve">Prices shown as sign/exponent/fraction bits (32 and 64 bit). Stock value is computed in float32. Add/sub/mul/div are shown as align → operate → normalise → round → pack.</w:t>
+                    <w:t xml:space="preserve">Stock › filters, status</w:t>
+                  </w:r>
+                </w:p>
+              </w:tc>
+              <w:tc>
+                <w:tcPr>
+                  <w:tcW w:type="dxa" w:w="4510"/>
+                  <w:tcBorders>
+                    <w:top w:val="single" w:color="000000" w:sz="4"/>
+                    <w:left w:val="single" w:color="000000" w:sz="4"/>
+                    <w:bottom w:val="single" w:color="000000" w:sz="4"/>
+                    <w:right w:val="single" w:color="000000" w:sz="4"/>
+                  </w:tcBorders>
+                  <w:tcMar>
+                    <w:top w:type="dxa" w:w="40"/>
+                    <w:left w:type="dxa" w:w="90"/>
+                    <w:bottom w:type="dxa" w:w="40"/>
+                    <w:right w:type="dxa" w:w="90"/>
+                  </w:tcMar>
+                  <w:vAlign w:val="top"/>
+                </w:tcPr>
+                <w:p>
+                  <w:pPr>
+                    <w:spacing w:after="0" w:line="240"/>
+                    <w:jc w:val="left"/>
+                  </w:pPr>
+                  <w:r>
+                    <w:rPr>
+                      <w:rFonts w:ascii="Times New Roman" w:cs="Times New Roman" w:eastAsia="Times New Roman" w:hAnsi="Times New Roman"/>
+                      <w:b w:val="false"/>
+                      <w:bCs w:val="false"/>
+                      <w:sz w:val="18"/>
+                      <w:szCs w:val="18"/>
+                    </w:rPr>
+                    <w:t xml:space="preserve">An 8-bit status register per medicine. OR sets the bits; the Reorder and Expiry filters are AND masks 0000 0011 and 0000 1100.</w:t>
                   </w:r>
                 </w:p>
               </w:tc>
@@ -3095,7 +3199,7 @@
               </w:trPr>
               <w:tc>
                 <w:tcPr>
-                  <w:tcW w:type="dxa" w:w="2000"/>
+                  <w:tcW w:type="dxa" w:w="1700"/>
                   <w:tcBorders>
                     <w:top w:val="single" w:color="000000" w:sz="4"/>
                     <w:left w:val="single" w:color="000000" w:sz="4"/>
@@ -3123,13 +3227,13 @@
                       <w:sz w:val="18"/>
                       <w:szCs w:val="18"/>
                     </w:rPr>
-                    <w:t xml:space="preserve">Instruction types, formats (U3)</w:t>
-                  </w:r>
-                </w:p>
-              </w:tc>
-              <w:tc>
-                <w:tcPr>
-                  <w:tcW w:type="dxa" w:w="5960"/>
+                    <w:t xml:space="preserve">IEEE 754 (U2)</w:t>
+                  </w:r>
+                </w:p>
+              </w:tc>
+              <w:tc>
+                <w:tcPr>
+                  <w:tcW w:type="dxa" w:w="1750"/>
                   <w:tcBorders>
                     <w:top w:val="single" w:color="000000" w:sz="4"/>
                     <w:left w:val="single" w:color="000000" w:sz="4"/>
@@ -3157,7 +3261,41 @@
                       <w:sz w:val="18"/>
                       <w:szCs w:val="18"/>
                     </w:rPr>
-                    <w:t xml:space="preserve">“PharmaCPU”: 16-bit words, 16 instructions, 5 formats (R, I, M, X, B); data-transfer, arithmetic, logical and program-control types.</w:t>
+                    <w:t xml:space="preserve">Stock › price; Lab › Floating point</w:t>
+                  </w:r>
+                </w:p>
+              </w:tc>
+              <w:tc>
+                <w:tcPr>
+                  <w:tcW w:type="dxa" w:w="4510"/>
+                  <w:tcBorders>
+                    <w:top w:val="single" w:color="000000" w:sz="4"/>
+                    <w:left w:val="single" w:color="000000" w:sz="4"/>
+                    <w:bottom w:val="single" w:color="000000" w:sz="4"/>
+                    <w:right w:val="single" w:color="000000" w:sz="4"/>
+                  </w:tcBorders>
+                  <w:tcMar>
+                    <w:top w:type="dxa" w:w="40"/>
+                    <w:left w:type="dxa" w:w="90"/>
+                    <w:bottom w:type="dxa" w:w="40"/>
+                    <w:right w:type="dxa" w:w="90"/>
+                  </w:tcMar>
+                  <w:vAlign w:val="top"/>
+                </w:tcPr>
+                <w:p>
+                  <w:pPr>
+                    <w:spacing w:after="0" w:line="240"/>
+                    <w:jc w:val="left"/>
+                  </w:pPr>
+                  <w:r>
+                    <w:rPr>
+                      <w:rFonts w:ascii="Times New Roman" w:cs="Times New Roman" w:eastAsia="Times New Roman" w:hAnsi="Times New Roman"/>
+                      <w:b w:val="false"/>
+                      <w:bCs w:val="false"/>
+                      <w:sz w:val="18"/>
+                      <w:szCs w:val="18"/>
+                    </w:rPr>
+                    <w:t xml:space="preserve">Each unit price is stored as a 32-bit word, e.g. ₹6.40 = 0x40CCCCCD (sign, exponent, fraction).</w:t>
                   </w:r>
                 </w:p>
               </w:tc>
@@ -3168,7 +3306,7 @@
               </w:trPr>
               <w:tc>
                 <w:tcPr>
-                  <w:tcW w:type="dxa" w:w="2000"/>
+                  <w:tcW w:type="dxa" w:w="1700"/>
                   <w:tcBorders>
                     <w:top w:val="single" w:color="000000" w:sz="4"/>
                     <w:left w:val="single" w:color="000000" w:sz="4"/>
@@ -3196,13 +3334,13 @@
                       <w:sz w:val="18"/>
                       <w:szCs w:val="18"/>
                     </w:rPr>
-                    <w:t xml:space="preserve">Instruction cycle, micro-ops (U3)</w:t>
-                  </w:r>
-                </w:p>
-              </w:tc>
-              <w:tc>
-                <w:tcPr>
-                  <w:tcW w:type="dxa" w:w="5960"/>
+                    <w:t xml:space="preserve">Floating point arithmetic (U2)</w:t>
+                  </w:r>
+                </w:p>
+              </w:tc>
+              <w:tc>
+                <w:tcPr>
+                  <w:tcW w:type="dxa" w:w="1750"/>
                   <w:tcBorders>
                     <w:top w:val="single" w:color="000000" w:sz="4"/>
                     <w:left w:val="single" w:color="000000" w:sz="4"/>
@@ -3230,7 +3368,41 @@
                       <w:sz w:val="18"/>
                       <w:szCs w:val="18"/>
                     </w:rPr>
-                    <w:t xml:space="preserve">Fetch (T0–T2), decode (T3) and execute (T4…) run clock by clock as RTL micro-operations, e.g. MAR ← PC, MBR ← M[MAR].</w:t>
+                    <w:t xml:space="preserve">Stock › value; Lab › Floating point</w:t>
+                  </w:r>
+                </w:p>
+              </w:tc>
+              <w:tc>
+                <w:tcPr>
+                  <w:tcW w:type="dxa" w:w="4510"/>
+                  <w:tcBorders>
+                    <w:top w:val="single" w:color="000000" w:sz="4"/>
+                    <w:left w:val="single" w:color="000000" w:sz="4"/>
+                    <w:bottom w:val="single" w:color="000000" w:sz="4"/>
+                    <w:right w:val="single" w:color="000000" w:sz="4"/>
+                  </w:tcBorders>
+                  <w:tcMar>
+                    <w:top w:type="dxa" w:w="40"/>
+                    <w:left w:type="dxa" w:w="90"/>
+                    <w:bottom w:type="dxa" w:w="40"/>
+                    <w:right w:type="dxa" w:w="90"/>
+                  </w:tcMar>
+                  <w:vAlign w:val="top"/>
+                </w:tcPr>
+                <w:p>
+                  <w:pPr>
+                    <w:spacing w:after="0" w:line="240"/>
+                    <w:jc w:val="left"/>
+                  </w:pPr>
+                  <w:r>
+                    <w:rPr>
+                      <w:rFonts w:ascii="Times New Roman" w:cs="Times New Roman" w:eastAsia="Times New Roman" w:hAnsi="Times New Roman"/>
+                      <w:b w:val="false"/>
+                      <w:bCs w:val="false"/>
+                      <w:sz w:val="18"/>
+                      <w:szCs w:val="18"/>
+                    </w:rPr>
+                    <w:t xml:space="preserve">Stock value = price × units in float32. Add/sub/mul/div are shown as align → operate → normalise → round → pack.</w:t>
                   </w:r>
                 </w:p>
               </w:tc>
@@ -3241,7 +3413,7 @@
               </w:trPr>
               <w:tc>
                 <w:tcPr>
-                  <w:tcW w:type="dxa" w:w="2000"/>
+                  <w:tcW w:type="dxa" w:w="1700"/>
                   <w:tcBorders>
                     <w:top w:val="single" w:color="000000" w:sz="4"/>
                     <w:left w:val="single" w:color="000000" w:sz="4"/>
@@ -3269,13 +3441,13 @@
                       <w:sz w:val="18"/>
                       <w:szCs w:val="18"/>
                     </w:rPr>
-                    <w:t xml:space="preserve">Program control, RISC/CISC (U3)</w:t>
-                  </w:r>
-                </w:p>
-              </w:tc>
-              <w:tc>
-                <w:tcPr>
-                  <w:tcW w:type="dxa" w:w="5960"/>
+                    <w:t xml:space="preserve">Instruction types &amp; formats (U3)</w:t>
+                  </w:r>
+                </w:p>
+              </w:tc>
+              <w:tc>
+                <w:tcPr>
+                  <w:tcW w:type="dxa" w:w="1750"/>
                   <w:tcBorders>
                     <w:top w:val="single" w:color="000000" w:sz="4"/>
                     <w:left w:val="single" w:color="000000" w:sz="4"/>
@@ -3303,7 +3475,41 @@
                       <w:sz w:val="18"/>
                       <w:szCs w:val="18"/>
                     </w:rPr>
-                    <w:t xml:space="preserve">JN/JZ/JNZ loops scan inventory records in memory. A 4-instruction RISC load/store sequence is compared with one CISC memory-to-memory instruction.</w:t>
+                    <w:t xml:space="preserve">Lab › Instruction set</w:t>
+                  </w:r>
+                </w:p>
+              </w:tc>
+              <w:tc>
+                <w:tcPr>
+                  <w:tcW w:type="dxa" w:w="4510"/>
+                  <w:tcBorders>
+                    <w:top w:val="single" w:color="000000" w:sz="4"/>
+                    <w:left w:val="single" w:color="000000" w:sz="4"/>
+                    <w:bottom w:val="single" w:color="000000" w:sz="4"/>
+                    <w:right w:val="single" w:color="000000" w:sz="4"/>
+                  </w:tcBorders>
+                  <w:tcMar>
+                    <w:top w:type="dxa" w:w="40"/>
+                    <w:left w:type="dxa" w:w="90"/>
+                    <w:bottom w:type="dxa" w:w="40"/>
+                    <w:right w:type="dxa" w:w="90"/>
+                  </w:tcMar>
+                  <w:vAlign w:val="top"/>
+                </w:tcPr>
+                <w:p>
+                  <w:pPr>
+                    <w:spacing w:after="0" w:line="240"/>
+                    <w:jc w:val="left"/>
+                  </w:pPr>
+                  <w:r>
+                    <w:rPr>
+                      <w:rFonts w:ascii="Times New Roman" w:cs="Times New Roman" w:eastAsia="Times New Roman" w:hAnsi="Times New Roman"/>
+                      <w:b w:val="false"/>
+                      <w:bCs w:val="false"/>
+                      <w:sz w:val="18"/>
+                      <w:szCs w:val="18"/>
+                    </w:rPr>
+                    <w:t xml:space="preserve">16 instructions in four types (data transfer, arithmetic, logical, program control) and five 16-bit formats.</w:t>
                   </w:r>
                 </w:p>
               </w:tc>
@@ -3314,7 +3520,7 @@
               </w:trPr>
               <w:tc>
                 <w:tcPr>
-                  <w:tcW w:type="dxa" w:w="2000"/>
+                  <w:tcW w:type="dxa" w:w="1700"/>
                   <w:tcBorders>
                     <w:top w:val="single" w:color="000000" w:sz="4"/>
                     <w:left w:val="single" w:color="000000" w:sz="4"/>
@@ -3342,13 +3548,13 @@
                       <w:sz w:val="18"/>
                       <w:szCs w:val="18"/>
                     </w:rPr>
-                    <w:t xml:space="preserve">Pipelining (U3)</w:t>
-                  </w:r>
-                </w:p>
-              </w:tc>
-              <w:tc>
-                <w:tcPr>
-                  <w:tcW w:type="dxa" w:w="5960"/>
+                    <w:t xml:space="preserve">Instruction cycle, micro-ops (U3)</w:t>
+                  </w:r>
+                </w:p>
+              </w:tc>
+              <w:tc>
+                <w:tcPr>
+                  <w:tcW w:type="dxa" w:w="1750"/>
                   <w:tcBorders>
                     <w:top w:val="single" w:color="000000" w:sz="4"/>
                     <w:left w:val="single" w:color="000000" w:sz="4"/>
@@ -3376,7 +3582,41 @@
                       <w:sz w:val="18"/>
                       <w:szCs w:val="18"/>
                     </w:rPr>
-                    <w:t xml:space="preserve">5-stage IF–ID–EX–MEM–WB timing diagram with RAW hazards, operand forwarding and branch flushes.</w:t>
+                    <w:t xml:space="preserve">Lab › Instruction cycle</w:t>
+                  </w:r>
+                </w:p>
+              </w:tc>
+              <w:tc>
+                <w:tcPr>
+                  <w:tcW w:type="dxa" w:w="4510"/>
+                  <w:tcBorders>
+                    <w:top w:val="single" w:color="000000" w:sz="4"/>
+                    <w:left w:val="single" w:color="000000" w:sz="4"/>
+                    <w:bottom w:val="single" w:color="000000" w:sz="4"/>
+                    <w:right w:val="single" w:color="000000" w:sz="4"/>
+                  </w:tcBorders>
+                  <w:tcMar>
+                    <w:top w:type="dxa" w:w="40"/>
+                    <w:left w:type="dxa" w:w="90"/>
+                    <w:bottom w:type="dxa" w:w="40"/>
+                    <w:right w:type="dxa" w:w="90"/>
+                  </w:tcMar>
+                  <w:vAlign w:val="top"/>
+                </w:tcPr>
+                <w:p>
+                  <w:pPr>
+                    <w:spacing w:after="0" w:line="240"/>
+                    <w:jc w:val="left"/>
+                  </w:pPr>
+                  <w:r>
+                    <w:rPr>
+                      <w:rFonts w:ascii="Times New Roman" w:cs="Times New Roman" w:eastAsia="Times New Roman" w:hAnsi="Times New Roman"/>
+                      <w:b w:val="false"/>
+                      <w:bCs w:val="false"/>
+                      <w:sz w:val="18"/>
+                      <w:szCs w:val="18"/>
+                    </w:rPr>
+                    <w:t xml:space="preserve">Inventory programs run one clock at a time: fetch T0–T2, decode T3, execute T4…, each step a micro-operation such as MAR ← PC.</w:t>
                   </w:r>
                 </w:p>
               </w:tc>
@@ -3387,7 +3627,7 @@
               </w:trPr>
               <w:tc>
                 <w:tcPr>
-                  <w:tcW w:type="dxa" w:w="2000"/>
+                  <w:tcW w:type="dxa" w:w="1700"/>
                   <w:tcBorders>
                     <w:top w:val="single" w:color="000000" w:sz="4"/>
                     <w:left w:val="single" w:color="000000" w:sz="4"/>
@@ -3415,13 +3655,13 @@
                       <w:sz w:val="18"/>
                       <w:szCs w:val="18"/>
                     </w:rPr>
-                    <w:t xml:space="preserve">Hardwired vs micro-programmed (U3)</w:t>
-                  </w:r>
-                </w:p>
-              </w:tc>
-              <w:tc>
-                <w:tcPr>
-                  <w:tcW w:type="dxa" w:w="5960"/>
+                    <w:t xml:space="preserve">Program control (U3)</w:t>
+                  </w:r>
+                </w:p>
+              </w:tc>
+              <w:tc>
+                <w:tcPr>
+                  <w:tcW w:type="dxa" w:w="1750"/>
                   <w:tcBorders>
                     <w:top w:val="single" w:color="000000" w:sz="4"/>
                     <w:left w:val="single" w:color="000000" w:sz="4"/>
@@ -3449,7 +3689,41 @@
                       <w:sz w:val="18"/>
                       <w:szCs w:val="18"/>
                     </w:rPr>
-                    <w:t xml:space="preserve">Hardwired: T-states × opcode decoder (Dᵢ·Tⱼ). Microprogrammed: control memory, CAR and mapping logic; horizontal (24-bit) vs vertical (26-bit) microcode.</w:t>
+                    <w:t xml:space="preserve">Lab › Instruction cycle</w:t>
+                  </w:r>
+                </w:p>
+              </w:tc>
+              <w:tc>
+                <w:tcPr>
+                  <w:tcW w:type="dxa" w:w="4510"/>
+                  <w:tcBorders>
+                    <w:top w:val="single" w:color="000000" w:sz="4"/>
+                    <w:left w:val="single" w:color="000000" w:sz="4"/>
+                    <w:bottom w:val="single" w:color="000000" w:sz="4"/>
+                    <w:right w:val="single" w:color="000000" w:sz="4"/>
+                  </w:tcBorders>
+                  <w:tcMar>
+                    <w:top w:type="dxa" w:w="40"/>
+                    <w:left w:type="dxa" w:w="90"/>
+                    <w:bottom w:type="dxa" w:w="40"/>
+                    <w:right w:type="dxa" w:w="90"/>
+                  </w:tcMar>
+                  <w:vAlign w:val="top"/>
+                </w:tcPr>
+                <w:p>
+                  <w:pPr>
+                    <w:spacing w:after="0" w:line="240"/>
+                    <w:jc w:val="left"/>
+                  </w:pPr>
+                  <w:r>
+                    <w:rPr>
+                      <w:rFonts w:ascii="Times New Roman" w:cs="Times New Roman" w:eastAsia="Times New Roman" w:hAnsi="Times New Roman"/>
+                      <w:b w:val="false"/>
+                      <w:bCs w:val="false"/>
+                      <w:sz w:val="18"/>
+                      <w:szCs w:val="18"/>
+                    </w:rPr>
+                    <w:t xml:space="preserve">JN, JZ and JNZ loops scan every medicine record to count low-stock and expiring items.</w:t>
                   </w:r>
                 </w:p>
               </w:tc>
@@ -3460,7 +3734,7 @@
               </w:trPr>
               <w:tc>
                 <w:tcPr>
-                  <w:tcW w:type="dxa" w:w="2000"/>
+                  <w:tcW w:type="dxa" w:w="1700"/>
                   <w:tcBorders>
                     <w:top w:val="single" w:color="000000" w:sz="4"/>
                     <w:left w:val="single" w:color="000000" w:sz="4"/>
@@ -3488,13 +3762,13 @@
                       <w:sz w:val="18"/>
                       <w:szCs w:val="18"/>
                     </w:rPr>
-                    <w:t xml:space="preserve">Flynn’s classification (U3)</w:t>
-                  </w:r>
-                </w:p>
-              </w:tc>
-              <w:tc>
-                <w:tcPr>
-                  <w:tcW w:type="dxa" w:w="5960"/>
+                    <w:t xml:space="preserve">RISC vs CISC (U3)</w:t>
+                  </w:r>
+                </w:p>
+              </w:tc>
+              <w:tc>
+                <w:tcPr>
+                  <w:tcW w:type="dxa" w:w="1750"/>
                   <w:tcBorders>
                     <w:top w:val="single" w:color="000000" w:sz="4"/>
                     <w:left w:val="single" w:color="000000" w:sz="4"/>
@@ -3522,7 +3796,362 @@
                       <w:sz w:val="18"/>
                       <w:szCs w:val="18"/>
                     </w:rPr>
-                    <w:t xml:space="preserve">Animated SISD vs SIMD expiry scan (4 lanes → 4× fewer steps), with MISD and MIMD pharmacy examples.</w:t>
+                    <w:t xml:space="preserve">Lab › Pipelining</w:t>
+                  </w:r>
+                </w:p>
+              </w:tc>
+              <w:tc>
+                <w:tcPr>
+                  <w:tcW w:type="dxa" w:w="4510"/>
+                  <w:tcBorders>
+                    <w:top w:val="single" w:color="000000" w:sz="4"/>
+                    <w:left w:val="single" w:color="000000" w:sz="4"/>
+                    <w:bottom w:val="single" w:color="000000" w:sz="4"/>
+                    <w:right w:val="single" w:color="000000" w:sz="4"/>
+                  </w:tcBorders>
+                  <w:tcMar>
+                    <w:top w:type="dxa" w:w="40"/>
+                    <w:left w:type="dxa" w:w="90"/>
+                    <w:bottom w:type="dxa" w:w="40"/>
+                    <w:right w:type="dxa" w:w="90"/>
+                  </w:tcMar>
+                  <w:vAlign w:val="top"/>
+                </w:tcPr>
+                <w:p>
+                  <w:pPr>
+                    <w:spacing w:after="0" w:line="240"/>
+                    <w:jc w:val="left"/>
+                  </w:pPr>
+                  <w:r>
+                    <w:rPr>
+                      <w:rFonts w:ascii="Times New Roman" w:cs="Times New Roman" w:eastAsia="Times New Roman" w:hAnsi="Times New Roman"/>
+                      <w:b w:val="false"/>
+                      <w:bCs w:val="false"/>
+                      <w:sz w:val="18"/>
+                      <w:szCs w:val="18"/>
+                    </w:rPr>
+                    <w:t xml:space="preserve">A sale is LOAD, LOAD, SUB, STORE on our RISC machine, compared with one CISC memory-to-memory SUBM.</w:t>
+                  </w:r>
+                </w:p>
+              </w:tc>
+            </w:tr>
+            <w:tr>
+              <w:trPr>
+                <w:cantSplit/>
+              </w:trPr>
+              <w:tc>
+                <w:tcPr>
+                  <w:tcW w:type="dxa" w:w="1700"/>
+                  <w:tcBorders>
+                    <w:top w:val="single" w:color="000000" w:sz="4"/>
+                    <w:left w:val="single" w:color="000000" w:sz="4"/>
+                    <w:bottom w:val="single" w:color="000000" w:sz="4"/>
+                    <w:right w:val="single" w:color="000000" w:sz="4"/>
+                  </w:tcBorders>
+                  <w:tcMar>
+                    <w:top w:type="dxa" w:w="40"/>
+                    <w:left w:type="dxa" w:w="90"/>
+                    <w:bottom w:type="dxa" w:w="40"/>
+                    <w:right w:type="dxa" w:w="90"/>
+                  </w:tcMar>
+                  <w:vAlign w:val="top"/>
+                </w:tcPr>
+                <w:p>
+                  <w:pPr>
+                    <w:spacing w:after="0" w:line="240"/>
+                    <w:jc w:val="left"/>
+                  </w:pPr>
+                  <w:r>
+                    <w:rPr>
+                      <w:rFonts w:ascii="Times New Roman" w:cs="Times New Roman" w:eastAsia="Times New Roman" w:hAnsi="Times New Roman"/>
+                      <w:b w:val="false"/>
+                      <w:bCs w:val="false"/>
+                      <w:sz w:val="18"/>
+                      <w:szCs w:val="18"/>
+                    </w:rPr>
+                    <w:t xml:space="preserve">Pipelining (U3)</w:t>
+                  </w:r>
+                </w:p>
+              </w:tc>
+              <w:tc>
+                <w:tcPr>
+                  <w:tcW w:type="dxa" w:w="1750"/>
+                  <w:tcBorders>
+                    <w:top w:val="single" w:color="000000" w:sz="4"/>
+                    <w:left w:val="single" w:color="000000" w:sz="4"/>
+                    <w:bottom w:val="single" w:color="000000" w:sz="4"/>
+                    <w:right w:val="single" w:color="000000" w:sz="4"/>
+                  </w:tcBorders>
+                  <w:tcMar>
+                    <w:top w:type="dxa" w:w="40"/>
+                    <w:left w:type="dxa" w:w="90"/>
+                    <w:bottom w:type="dxa" w:w="40"/>
+                    <w:right w:type="dxa" w:w="90"/>
+                  </w:tcMar>
+                  <w:vAlign w:val="top"/>
+                </w:tcPr>
+                <w:p>
+                  <w:pPr>
+                    <w:spacing w:after="0" w:line="240"/>
+                    <w:jc w:val="left"/>
+                  </w:pPr>
+                  <w:r>
+                    <w:rPr>
+                      <w:rFonts w:ascii="Times New Roman" w:cs="Times New Roman" w:eastAsia="Times New Roman" w:hAnsi="Times New Roman"/>
+                      <w:b w:val="false"/>
+                      <w:bCs w:val="false"/>
+                      <w:sz w:val="18"/>
+                      <w:szCs w:val="18"/>
+                    </w:rPr>
+                    <w:t xml:space="preserve">Lab › Pipelining</w:t>
+                  </w:r>
+                </w:p>
+              </w:tc>
+              <w:tc>
+                <w:tcPr>
+                  <w:tcW w:type="dxa" w:w="4510"/>
+                  <w:tcBorders>
+                    <w:top w:val="single" w:color="000000" w:sz="4"/>
+                    <w:left w:val="single" w:color="000000" w:sz="4"/>
+                    <w:bottom w:val="single" w:color="000000" w:sz="4"/>
+                    <w:right w:val="single" w:color="000000" w:sz="4"/>
+                  </w:tcBorders>
+                  <w:tcMar>
+                    <w:top w:type="dxa" w:w="40"/>
+                    <w:left w:type="dxa" w:w="90"/>
+                    <w:bottom w:type="dxa" w:w="40"/>
+                    <w:right w:type="dxa" w:w="90"/>
+                  </w:tcMar>
+                  <w:vAlign w:val="top"/>
+                </w:tcPr>
+                <w:p>
+                  <w:pPr>
+                    <w:spacing w:after="0" w:line="240"/>
+                    <w:jc w:val="left"/>
+                  </w:pPr>
+                  <w:r>
+                    <w:rPr>
+                      <w:rFonts w:ascii="Times New Roman" w:cs="Times New Roman" w:eastAsia="Times New Roman" w:hAnsi="Times New Roman"/>
+                      <w:b w:val="false"/>
+                      <w:bCs w:val="false"/>
+                      <w:sz w:val="18"/>
+                      <w:szCs w:val="18"/>
+                    </w:rPr>
+                    <w:t xml:space="preserve">A 5-stage timing diagram of the low-stock scan, with RAW stalls, forwarding and branch flushes.</w:t>
+                  </w:r>
+                </w:p>
+              </w:tc>
+            </w:tr>
+            <w:tr>
+              <w:trPr>
+                <w:cantSplit/>
+              </w:trPr>
+              <w:tc>
+                <w:tcPr>
+                  <w:tcW w:type="dxa" w:w="1700"/>
+                  <w:tcBorders>
+                    <w:top w:val="single" w:color="000000" w:sz="4"/>
+                    <w:left w:val="single" w:color="000000" w:sz="4"/>
+                    <w:bottom w:val="single" w:color="000000" w:sz="4"/>
+                    <w:right w:val="single" w:color="000000" w:sz="4"/>
+                  </w:tcBorders>
+                  <w:tcMar>
+                    <w:top w:type="dxa" w:w="40"/>
+                    <w:left w:type="dxa" w:w="90"/>
+                    <w:bottom w:type="dxa" w:w="40"/>
+                    <w:right w:type="dxa" w:w="90"/>
+                  </w:tcMar>
+                  <w:vAlign w:val="top"/>
+                </w:tcPr>
+                <w:p>
+                  <w:pPr>
+                    <w:spacing w:after="0" w:line="240"/>
+                    <w:jc w:val="left"/>
+                  </w:pPr>
+                  <w:r>
+                    <w:rPr>
+                      <w:rFonts w:ascii="Times New Roman" w:cs="Times New Roman" w:eastAsia="Times New Roman" w:hAnsi="Times New Roman"/>
+                      <w:b w:val="false"/>
+                      <w:bCs w:val="false"/>
+                      <w:sz w:val="18"/>
+                      <w:szCs w:val="18"/>
+                    </w:rPr>
+                    <w:t xml:space="preserve">Hardwired vs micro-programmed control (U3)</w:t>
+                  </w:r>
+                </w:p>
+              </w:tc>
+              <w:tc>
+                <w:tcPr>
+                  <w:tcW w:type="dxa" w:w="1750"/>
+                  <w:tcBorders>
+                    <w:top w:val="single" w:color="000000" w:sz="4"/>
+                    <w:left w:val="single" w:color="000000" w:sz="4"/>
+                    <w:bottom w:val="single" w:color="000000" w:sz="4"/>
+                    <w:right w:val="single" w:color="000000" w:sz="4"/>
+                  </w:tcBorders>
+                  <w:tcMar>
+                    <w:top w:type="dxa" w:w="40"/>
+                    <w:left w:type="dxa" w:w="90"/>
+                    <w:bottom w:type="dxa" w:w="40"/>
+                    <w:right w:type="dxa" w:w="90"/>
+                  </w:tcMar>
+                  <w:vAlign w:val="top"/>
+                </w:tcPr>
+                <w:p>
+                  <w:pPr>
+                    <w:spacing w:after="0" w:line="240"/>
+                    <w:jc w:val="left"/>
+                  </w:pPr>
+                  <w:r>
+                    <w:rPr>
+                      <w:rFonts w:ascii="Times New Roman" w:cs="Times New Roman" w:eastAsia="Times New Roman" w:hAnsi="Times New Roman"/>
+                      <w:b w:val="false"/>
+                      <w:bCs w:val="false"/>
+                      <w:sz w:val="18"/>
+                      <w:szCs w:val="18"/>
+                    </w:rPr>
+                    <w:t xml:space="preserve">Lab › Control design</w:t>
+                  </w:r>
+                </w:p>
+              </w:tc>
+              <w:tc>
+                <w:tcPr>
+                  <w:tcW w:type="dxa" w:w="4510"/>
+                  <w:tcBorders>
+                    <w:top w:val="single" w:color="000000" w:sz="4"/>
+                    <w:left w:val="single" w:color="000000" w:sz="4"/>
+                    <w:bottom w:val="single" w:color="000000" w:sz="4"/>
+                    <w:right w:val="single" w:color="000000" w:sz="4"/>
+                  </w:tcBorders>
+                  <w:tcMar>
+                    <w:top w:type="dxa" w:w="40"/>
+                    <w:left w:type="dxa" w:w="90"/>
+                    <w:bottom w:type="dxa" w:w="40"/>
+                    <w:right w:type="dxa" w:w="90"/>
+                  </w:tcMar>
+                  <w:vAlign w:val="top"/>
+                </w:tcPr>
+                <w:p>
+                  <w:pPr>
+                    <w:spacing w:after="0" w:line="240"/>
+                    <w:jc w:val="left"/>
+                  </w:pPr>
+                  <w:r>
+                    <w:rPr>
+                      <w:rFonts w:ascii="Times New Roman" w:cs="Times New Roman" w:eastAsia="Times New Roman" w:hAnsi="Times New Roman"/>
+                      <w:b w:val="false"/>
+                      <w:bCs w:val="false"/>
+                      <w:sz w:val="18"/>
+                      <w:szCs w:val="18"/>
+                    </w:rPr>
+                    <w:t xml:space="preserve">Control terms per instruction (e.g. D6·T4 for SUB), and the same steps as 24-bit horizontal / 26-bit vertical microcode words.</w:t>
+                  </w:r>
+                </w:p>
+              </w:tc>
+            </w:tr>
+            <w:tr>
+              <w:trPr>
+                <w:cantSplit/>
+              </w:trPr>
+              <w:tc>
+                <w:tcPr>
+                  <w:tcW w:type="dxa" w:w="1700"/>
+                  <w:tcBorders>
+                    <w:top w:val="single" w:color="000000" w:sz="4"/>
+                    <w:left w:val="single" w:color="000000" w:sz="4"/>
+                    <w:bottom w:val="single" w:color="000000" w:sz="4"/>
+                    <w:right w:val="single" w:color="000000" w:sz="4"/>
+                  </w:tcBorders>
+                  <w:tcMar>
+                    <w:top w:type="dxa" w:w="40"/>
+                    <w:left w:type="dxa" w:w="90"/>
+                    <w:bottom w:type="dxa" w:w="40"/>
+                    <w:right w:type="dxa" w:w="90"/>
+                  </w:tcMar>
+                  <w:vAlign w:val="top"/>
+                </w:tcPr>
+                <w:p>
+                  <w:pPr>
+                    <w:spacing w:after="0" w:line="240"/>
+                    <w:jc w:val="left"/>
+                  </w:pPr>
+                  <w:r>
+                    <w:rPr>
+                      <w:rFonts w:ascii="Times New Roman" w:cs="Times New Roman" w:eastAsia="Times New Roman" w:hAnsi="Times New Roman"/>
+                      <w:b w:val="false"/>
+                      <w:bCs w:val="false"/>
+                      <w:sz w:val="18"/>
+                      <w:szCs w:val="18"/>
+                    </w:rPr>
+                    <w:t xml:space="preserve">Flynn’s classification (U3)</w:t>
+                  </w:r>
+                </w:p>
+              </w:tc>
+              <w:tc>
+                <w:tcPr>
+                  <w:tcW w:type="dxa" w:w="1750"/>
+                  <w:tcBorders>
+                    <w:top w:val="single" w:color="000000" w:sz="4"/>
+                    <w:left w:val="single" w:color="000000" w:sz="4"/>
+                    <w:bottom w:val="single" w:color="000000" w:sz="4"/>
+                    <w:right w:val="single" w:color="000000" w:sz="4"/>
+                  </w:tcBorders>
+                  <w:tcMar>
+                    <w:top w:type="dxa" w:w="40"/>
+                    <w:left w:type="dxa" w:w="90"/>
+                    <w:bottom w:type="dxa" w:w="40"/>
+                    <w:right w:type="dxa" w:w="90"/>
+                  </w:tcMar>
+                  <w:vAlign w:val="top"/>
+                </w:tcPr>
+                <w:p>
+                  <w:pPr>
+                    <w:spacing w:after="0" w:line="240"/>
+                    <w:jc w:val="left"/>
+                  </w:pPr>
+                  <w:r>
+                    <w:rPr>
+                      <w:rFonts w:ascii="Times New Roman" w:cs="Times New Roman" w:eastAsia="Times New Roman" w:hAnsi="Times New Roman"/>
+                      <w:b w:val="false"/>
+                      <w:bCs w:val="false"/>
+                      <w:sz w:val="18"/>
+                      <w:szCs w:val="18"/>
+                    </w:rPr>
+                    <w:t xml:space="preserve">Lab › Flynn’s taxonomy</w:t>
+                  </w:r>
+                </w:p>
+              </w:tc>
+              <w:tc>
+                <w:tcPr>
+                  <w:tcW w:type="dxa" w:w="4510"/>
+                  <w:tcBorders>
+                    <w:top w:val="single" w:color="000000" w:sz="4"/>
+                    <w:left w:val="single" w:color="000000" w:sz="4"/>
+                    <w:bottom w:val="single" w:color="000000" w:sz="4"/>
+                    <w:right w:val="single" w:color="000000" w:sz="4"/>
+                  </w:tcBorders>
+                  <w:tcMar>
+                    <w:top w:type="dxa" w:w="40"/>
+                    <w:left w:type="dxa" w:w="90"/>
+                    <w:bottom w:type="dxa" w:w="40"/>
+                    <w:right w:type="dxa" w:w="90"/>
+                  </w:tcMar>
+                  <w:vAlign w:val="top"/>
+                </w:tcPr>
+                <w:p>
+                  <w:pPr>
+                    <w:spacing w:after="0" w:line="240"/>
+                    <w:jc w:val="left"/>
+                  </w:pPr>
+                  <w:r>
+                    <w:rPr>
+                      <w:rFonts w:ascii="Times New Roman" w:cs="Times New Roman" w:eastAsia="Times New Roman" w:hAnsi="Times New Roman"/>
+                      <w:b w:val="false"/>
+                      <w:bCs w:val="false"/>
+                      <w:sz w:val="18"/>
+                      <w:szCs w:val="18"/>
+                    </w:rPr>
+                    <w:t xml:space="preserve">An expiry scan as SISD (one date per step) vs SIMD (4 lanes → 4× fewer steps); MISD and MIMD pharmacy examples.</w:t>
                   </w:r>
                 </w:p>
               </w:tc>
@@ -3603,22 +4232,69 @@
             <w:r>
               <w:rPr>
                 <w:rFonts w:ascii="Times New Roman" w:cs="Times New Roman" w:eastAsia="Times New Roman" w:hAnsi="Times New Roman"/>
+                <w:sz w:val="19"/>
+                <w:szCs w:val="19"/>
+              </w:rPr>
+              <w:t xml:space="preserve">Each pharmacy operation was mapped to the CAPP concept that performs it (row 4) and built as a module the user can step through: alu.js (Unit 2), cpu.js (Unit 3), store.js (data), app.js (interface); tested in Node.js, deployed by GitHub Actions.</w:t>
+            </w:r>
+          </w:p>
+        </w:tc>
+      </w:tr>
+      <w:tr>
+        <w:trPr>
+          <w:cantSplit/>
+        </w:trPr>
+        <w:tc>
+          <w:tcPr>
+            <w:tcW w:type="dxa" w:w="1900"/>
+            <w:tcBorders>
+              <w:top w:val="single" w:color="000000" w:sz="4"/>
+              <w:left w:val="single" w:color="000000" w:sz="4"/>
+              <w:bottom w:val="single" w:color="000000" w:sz="4"/>
+              <w:right w:val="single" w:color="000000" w:sz="4"/>
+            </w:tcBorders>
+            <w:tcMar>
+              <w:top w:type="dxa" w:w="40"/>
+              <w:left w:type="dxa" w:w="90"/>
+              <w:bottom w:type="dxa" w:w="40"/>
+              <w:right w:type="dxa" w:w="90"/>
+            </w:tcMar>
+            <w:vAlign w:val="top"/>
+          </w:tcPr>
+          <w:p>
+            <w:pPr>
+              <w:spacing w:after="30" w:before="0" w:line="235"/>
+              <w:jc w:val="left"/>
+            </w:pPr>
+            <w:r>
+              <w:rPr>
+                <w:rFonts w:ascii="Times New Roman" w:cs="Times New Roman" w:eastAsia="Times New Roman" w:hAnsi="Times New Roman"/>
                 <w:b/>
                 <w:bCs/>
                 <w:sz w:val="19"/>
                 <w:szCs w:val="19"/>
               </w:rPr>
-              <w:t xml:space="preserve">Inventory:</w:t>
-            </w:r>
-            <w:r>
-              <w:rPr>
-                <w:rFonts w:ascii="Times New Roman" w:cs="Times New Roman" w:eastAsia="Times New Roman" w:hAnsi="Times New Roman"/>
-                <w:sz w:val="19"/>
-                <w:szCs w:val="19"/>
-              </w:rPr>
-              <w:t xml:space="preserve"> add, edit or sell a medicine → ALU ADD/SUB with flags → status register rebuilt with OR → alerts from AND masks → packs from division.</w:t>
-            </w:r>
-          </w:p>
+              <w:t xml:space="preserve">6. Work Completed During Month 2</w:t>
+            </w:r>
+          </w:p>
+        </w:tc>
+        <w:tc>
+          <w:tcPr>
+            <w:tcW w:type="dxa" w:w="8180"/>
+            <w:tcBorders>
+              <w:top w:val="single" w:color="000000" w:sz="4"/>
+              <w:left w:val="single" w:color="000000" w:sz="4"/>
+              <w:bottom w:val="single" w:color="000000" w:sz="4"/>
+              <w:right w:val="single" w:color="000000" w:sz="4"/>
+            </w:tcBorders>
+            <w:tcMar>
+              <w:top w:type="dxa" w:w="40"/>
+              <w:left w:type="dxa" w:w="90"/>
+              <w:bottom w:type="dxa" w:w="40"/>
+              <w:right w:type="dxa" w:w="90"/>
+            </w:tcMar>
+            <w:vAlign w:val="top"/>
+          </w:tcPr>
           <w:p>
             <w:pPr>
               <w:pStyle w:val="ListParagraph"/>
@@ -3637,7 +4313,7 @@
                 <w:sz w:val="19"/>
                 <w:szCs w:val="19"/>
               </w:rPr>
-              <w:t xml:space="preserve">CPU lab:</w:t>
+              <w:t xml:space="preserve">Stock view:</w:t>
             </w:r>
             <w:r>
               <w:rPr>
@@ -3645,7 +4321,7 @@
                 <w:sz w:val="19"/>
                 <w:szCs w:val="19"/>
               </w:rPr>
-              <w:t xml:space="preserve"> assembly program → two-pass assembler → machine code → clock-by-clock fetch/decode/execute on inventory data at 0x100 → dynamic trace → pipeline timing.</w:t>
+              <w:t xml:space="preserve"> medicine list, search, Reorder/Expiry filters, sell and restock through the ALU, and a detail panel showing the hardware behind each value.</w:t>
             </w:r>
           </w:p>
           <w:p>
@@ -3666,7 +4342,7 @@
                 <w:sz w:val="19"/>
                 <w:szCs w:val="19"/>
               </w:rPr>
-              <w:t xml:space="preserve">Tools:</w:t>
+              <w:t xml:space="preserve">Lab view:</w:t>
             </w:r>
             <w:r>
               <w:rPr>
@@ -3674,7 +4350,7 @@
                 <w:sz w:val="19"/>
                 <w:szCs w:val="19"/>
               </w:rPr>
-              <w:t xml:space="preserve"> JavaScript, HTML/CSS, Node.js (tests), Git/GitHub, GitHub Actions, GitHub Pages.</w:t>
+              <w:t xml:space="preserve"> 9 topics (ALU, division, multiplication, floating point, instruction set, instruction cycle, control design, pipelining, Flynn), plus automated tests and deployment.</w:t>
             </w:r>
           </w:p>
         </w:tc>
@@ -3713,7 +4389,7 @@
                 <w:sz w:val="19"/>
                 <w:szCs w:val="19"/>
               </w:rPr>
-              <w:t xml:space="preserve">6. Work Completed During Month 2</w:t>
+              <w:t xml:space="preserve">7. Analysis / Development / Implementation</w:t>
             </w:r>
           </w:p>
         </w:tc>
@@ -3747,10 +4423,20 @@
             <w:r>
               <w:rPr>
                 <w:rFonts w:ascii="Times New Roman" w:cs="Times New Roman" w:eastAsia="Times New Roman" w:hAnsi="Times New Roman"/>
+                <w:b/>
+                <w:bCs/>
                 <w:sz w:val="19"/>
                 <w:szCs w:val="19"/>
               </w:rPr>
-              <w:t xml:space="preserve">Inventory module (CRUD, sale/purchase through the ALU, bit-mask filter, dashboard alerts, JSON import/export).</w:t>
+              <w:t xml:space="preserve">Memory map:</w:t>
+            </w:r>
+            <w:r>
+              <w:rPr>
+                <w:rFonts w:ascii="Times New Roman" w:cs="Times New Roman" w:eastAsia="Times New Roman" w:hAnsi="Times New Roman"/>
+                <w:sz w:val="19"/>
+                <w:szCs w:val="19"/>
+              </w:rPr>
+              <w:t xml:space="preserve"> N at 0x100, then records [qty, reorder, status]; four assembly programs run on this data.</w:t>
             </w:r>
           </w:p>
           <w:p>
@@ -3766,69 +4452,22 @@
             <w:r>
               <w:rPr>
                 <w:rFonts w:ascii="Times New Roman" w:cs="Times New Roman" w:eastAsia="Times New Roman" w:hAnsi="Times New Roman"/>
-                <w:sz w:val="19"/>
-                <w:szCs w:val="19"/>
-              </w:rPr>
-              <w:t xml:space="preserve">ALU Lab (ALU, division, Booth, logic ops, IEEE 754, FP arithmetic); Control Unit Lab (ISA, assembler, CPU, control unit views, pipeline, RISC/CISC, Flynn); automated tests; deployment.</w:t>
-            </w:r>
-          </w:p>
-        </w:tc>
-      </w:tr>
-      <w:tr>
-        <w:trPr>
-          <w:cantSplit/>
-        </w:trPr>
-        <w:tc>
-          <w:tcPr>
-            <w:tcW w:type="dxa" w:w="1900"/>
-            <w:tcBorders>
-              <w:top w:val="single" w:color="000000" w:sz="4"/>
-              <w:left w:val="single" w:color="000000" w:sz="4"/>
-              <w:bottom w:val="single" w:color="000000" w:sz="4"/>
-              <w:right w:val="single" w:color="000000" w:sz="4"/>
-            </w:tcBorders>
-            <w:tcMar>
-              <w:top w:type="dxa" w:w="40"/>
-              <w:left w:type="dxa" w:w="90"/>
-              <w:bottom w:type="dxa" w:w="40"/>
-              <w:right w:type="dxa" w:w="90"/>
-            </w:tcMar>
-            <w:vAlign w:val="top"/>
-          </w:tcPr>
-          <w:p>
-            <w:pPr>
-              <w:spacing w:after="30" w:before="0" w:line="235"/>
-              <w:jc w:val="left"/>
-            </w:pPr>
-            <w:r>
-              <w:rPr>
-                <w:rFonts w:ascii="Times New Roman" w:cs="Times New Roman" w:eastAsia="Times New Roman" w:hAnsi="Times New Roman"/>
                 <w:b/>
                 <w:bCs/>
                 <w:sz w:val="19"/>
                 <w:szCs w:val="19"/>
               </w:rPr>
-              <w:t xml:space="preserve">7. Analysis / Development / Implementation</w:t>
-            </w:r>
-          </w:p>
-        </w:tc>
-        <w:tc>
-          <w:tcPr>
-            <w:tcW w:type="dxa" w:w="8180"/>
-            <w:tcBorders>
-              <w:top w:val="single" w:color="000000" w:sz="4"/>
-              <w:left w:val="single" w:color="000000" w:sz="4"/>
-              <w:bottom w:val="single" w:color="000000" w:sz="4"/>
-              <w:right w:val="single" w:color="000000" w:sz="4"/>
-            </w:tcBorders>
-            <w:tcMar>
-              <w:top w:type="dxa" w:w="40"/>
-              <w:left w:type="dxa" w:w="90"/>
-              <w:bottom w:type="dxa" w:w="40"/>
-              <w:right w:type="dxa" w:w="90"/>
-            </w:tcMar>
-            <w:vAlign w:val="top"/>
-          </w:tcPr>
+              <w:t xml:space="preserve">Example:</w:t>
+            </w:r>
+            <w:r>
+              <w:rPr>
+                <w:rFonts w:ascii="Times New Roman" w:cs="Times New Roman" w:eastAsia="Times New Roman" w:hAnsi="Times New Roman"/>
+                <w:sz w:val="19"/>
+                <w:szCs w:val="19"/>
+              </w:rPr>
+              <w:t xml:space="preserve"> selling 30 of 240 runs SUB 240, 30 → 210 (C = 1). Selling 40 of 36 gives C = 0 (a borrow), so the sale is refused. ₹6.40 × 36 = 230.40000915 in float32, bit-exact with the hardware.</w:t>
+            </w:r>
+          </w:p>
           <w:p>
             <w:pPr>
               <w:pStyle w:val="ListParagraph"/>
@@ -3847,7 +4486,7 @@
                 <w:sz w:val="19"/>
                 <w:szCs w:val="19"/>
               </w:rPr>
-              <w:t xml:space="preserve">Memory map:</w:t>
+              <w:t xml:space="preserve">Low-stock scan:</w:t>
             </w:r>
             <w:r>
               <w:rPr>
@@ -3855,102 +4494,12 @@
                 <w:sz w:val="19"/>
                 <w:szCs w:val="19"/>
               </w:rPr>
-              <w:t xml:space="preserve"> N at 0x100, then 3-word records [qty, reorder, status]; results at 0x1F0–0x1F2. Four assembly programs: low-stock count, total units, expiry scan (AND mask 0000 1100), record a sale.</w:t>
-            </w:r>
-          </w:p>
-          <w:p>
-            <w:pPr>
-              <w:pStyle w:val="ListParagraph"/>
-              <w:numPr>
-                <w:ilvl w:val="0"/>
-                <w:numId w:val="2"/>
-              </w:numPr>
-              <w:spacing w:after="20" w:line="235"/>
-              <w:jc w:val="both"/>
-            </w:pPr>
-            <w:r>
-              <w:rPr>
-                <w:rFonts w:ascii="Times New Roman" w:cs="Times New Roman" w:eastAsia="Times New Roman" w:hAnsi="Times New Roman"/>
-                <w:b/>
-                <w:bCs/>
-                <w:sz w:val="19"/>
-                <w:szCs w:val="19"/>
-              </w:rPr>
-              <w:t xml:space="preserve">Example:</w:t>
-            </w:r>
-            <w:r>
-              <w:rPr>
-                <w:rFonts w:ascii="Times New Roman" w:cs="Times New Roman" w:eastAsia="Times New Roman" w:hAnsi="Times New Roman"/>
-                <w:sz w:val="19"/>
-                <w:szCs w:val="19"/>
-              </w:rPr>
-              <w:t xml:space="preserve"> selling 30 of 120 units runs SUB 120, 30 → 90 with Z=0, N=0, C=1. Selling 50 of 36 gives C = 0 (borrow), so the sale is refused.</w:t>
-            </w:r>
-          </w:p>
-          <w:p>
-            <w:pPr>
-              <w:pStyle w:val="ListParagraph"/>
-              <w:numPr>
-                <w:ilvl w:val="0"/>
-                <w:numId w:val="2"/>
-              </w:numPr>
-              <w:spacing w:after="20" w:line="235"/>
-              <w:jc w:val="both"/>
-            </w:pPr>
-            <w:r>
-              <w:rPr>
-                <w:rFonts w:ascii="Times New Roman" w:cs="Times New Roman" w:eastAsia="Times New Roman" w:hAnsi="Times New Roman"/>
-                <w:b/>
-                <w:bCs/>
-                <w:sz w:val="19"/>
-                <w:szCs w:val="19"/>
-              </w:rPr>
-              <w:t xml:space="preserve">FP example:</w:t>
-            </w:r>
-            <w:r>
-              <w:rPr>
-                <w:rFonts w:ascii="Times New Roman" w:cs="Times New Roman" w:eastAsia="Times New Roman" w:hAnsi="Times New Roman"/>
-                <w:sz w:val="19"/>
-                <w:szCs w:val="19"/>
-              </w:rPr>
-              <w:t xml:space="preserve"> ₹6.40 × 36 in float32 → significands multiplied, normalised, rounded to nearest even → 230.40000915… (the bit-exact hardware result).</w:t>
-            </w:r>
-          </w:p>
-          <w:p>
-            <w:pPr>
-              <w:pStyle w:val="ListParagraph"/>
-              <w:numPr>
-                <w:ilvl w:val="0"/>
-                <w:numId w:val="2"/>
-              </w:numPr>
-              <w:spacing w:after="20" w:line="235"/>
-              <w:jc w:val="both"/>
-            </w:pPr>
-            <w:r>
-              <w:rPr>
-                <w:rFonts w:ascii="Times New Roman" w:cs="Times New Roman" w:eastAsia="Times New Roman" w:hAnsi="Times New Roman"/>
-                <w:b/>
-                <w:bCs/>
-                <w:sz w:val="19"/>
-                <w:szCs w:val="19"/>
-              </w:rPr>
-              <w:t xml:space="preserve">Low-stock program:</w:t>
-            </w:r>
-            <w:r>
-              <w:rPr>
-                <w:rFonts w:ascii="Times New Roman" w:cs="Times New Roman" w:eastAsia="Times New Roman" w:hAnsi="Times New Roman"/>
-                <w:sz w:val="19"/>
-                <w:szCs w:val="19"/>
-              </w:rPr>
-              <w:t xml:space="preserve"> found Amoxicillin, Metformin and ORS (3 items), the same as the dashboard. It ran 85 instructions in 535 clock cycles (T-states).</w:t>
+              <w:t xml:space="preserve"> found 3 medicines (Amoxicillin, Metformin, ORS), the same as the Stock view, in 85 instructions and 535 clock cycles.</w:t>
             </w:r>
           </w:p>
         </w:tc>
       </w:tr>
       <w:tr>
-        <w:trPr>
-          <w:cantSplit/>
-        </w:trPr>
         <w:tc>
           <w:tcPr>
             <w:tcW w:type="dxa" w:w="1900"/>
@@ -4748,25 +5297,6 @@
                 <w:sz w:val="19"/>
                 <w:szCs w:val="19"/>
               </w:rPr>
-              <w:t xml:space="preserve">Forwarding saves 10 cycles per program; the remaining stalls are load-use hazards and taken branches.</w:t>
-            </w:r>
-          </w:p>
-          <w:p>
-            <w:pPr>
-              <w:pStyle w:val="ListParagraph"/>
-              <w:numPr>
-                <w:ilvl w:val="0"/>
-                <w:numId w:val="2"/>
-              </w:numPr>
-              <w:spacing w:after="20" w:line="235"/>
-              <w:jc w:val="both"/>
-            </w:pPr>
-            <w:r>
-              <w:rPr>
-                <w:rFonts w:ascii="Times New Roman" w:cs="Times New Roman" w:eastAsia="Times New Roman" w:hAnsi="Times New Roman"/>
-                <w:sz w:val="19"/>
-                <w:szCs w:val="19"/>
-              </w:rPr>
               <w:t xml:space="preserve">FP results matched the hardware FPU in 80,000/80,000 random tests; all 84,374 automated checks pass.</w:t>
             </w:r>
           </w:p>
@@ -4857,24 +5387,13 @@
                 <w:t xml:space="preserve">github.com/utk042/CAPP-PBL</w:t>
               </w:r>
             </w:hyperlink>
-          </w:p>
-          <w:p>
-            <w:pPr>
-              <w:pStyle w:val="ListParagraph"/>
-              <w:numPr>
-                <w:ilvl w:val="0"/>
-                <w:numId w:val="2"/>
-              </w:numPr>
-              <w:spacing w:after="20" w:line="235"/>
-              <w:jc w:val="both"/>
-            </w:pPr>
             <w:r>
               <w:rPr>
                 <w:rFonts w:ascii="Times New Roman" w:cs="Times New Roman" w:eastAsia="Times New Roman" w:hAnsi="Times New Roman"/>
                 <w:sz w:val="19"/>
                 <w:szCs w:val="19"/>
               </w:rPr>
-              <w:t xml:space="preserve">Live app: </w:t>
+              <w:t xml:space="preserve"> · Live app: </w:t>
             </w:r>
             <w:hyperlink w:history="1" r:id="rIdCapp3">
               <w:r>
@@ -4888,72 +5407,7 @@
                 <w:t xml:space="preserve">utk042.github.io/CAPP-PBL/</w:t>
               </w:r>
             </w:hyperlink>
-            <w:r>
-              <w:rPr>
-                <w:rFonts w:ascii="Times New Roman" w:cs="Times New Roman" w:eastAsia="Times New Roman" w:hAnsi="Times New Roman"/>
-                <w:sz w:val="19"/>
-                <w:szCs w:val="19"/>
-              </w:rPr>
-              <w:t xml:space="preserve"> · Class notes and PPTs (Units 2 and 3) · Reference textbooks · Report I</w:t>
-            </w:r>
-          </w:p>
-        </w:tc>
-      </w:tr>
-      <w:tr>
-        <w:trPr>
-          <w:cantSplit/>
-        </w:trPr>
-        <w:tc>
-          <w:tcPr>
-            <w:tcW w:type="dxa" w:w="1900"/>
-            <w:tcBorders>
-              <w:top w:val="single" w:color="000000" w:sz="4"/>
-              <w:left w:val="single" w:color="000000" w:sz="4"/>
-              <w:bottom w:val="single" w:color="000000" w:sz="4"/>
-              <w:right w:val="single" w:color="000000" w:sz="4"/>
-            </w:tcBorders>
-            <w:tcMar>
-              <w:top w:type="dxa" w:w="40"/>
-              <w:left w:type="dxa" w:w="90"/>
-              <w:bottom w:type="dxa" w:w="40"/>
-              <w:right w:type="dxa" w:w="90"/>
-            </w:tcMar>
-            <w:vAlign w:val="top"/>
-          </w:tcPr>
-          <w:p>
-            <w:pPr>
-              <w:spacing w:after="30" w:before="0" w:line="235"/>
-              <w:jc w:val="left"/>
-            </w:pPr>
-            <w:r>
-              <w:rPr>
-                <w:rFonts w:ascii="Times New Roman" w:cs="Times New Roman" w:eastAsia="Times New Roman" w:hAnsi="Times New Roman"/>
-                <w:b/>
-                <w:bCs/>
-                <w:sz w:val="19"/>
-                <w:szCs w:val="19"/>
-              </w:rPr>
-              <w:t xml:space="preserve">10. Challenges &amp; Corrective Actions</w:t>
-            </w:r>
-          </w:p>
-        </w:tc>
-        <w:tc>
-          <w:tcPr>
-            <w:tcW w:type="dxa" w:w="8180"/>
-            <w:tcBorders>
-              <w:top w:val="single" w:color="000000" w:sz="4"/>
-              <w:left w:val="single" w:color="000000" w:sz="4"/>
-              <w:bottom w:val="single" w:color="000000" w:sz="4"/>
-              <w:right w:val="single" w:color="000000" w:sz="4"/>
-            </w:tcBorders>
-            <w:tcMar>
-              <w:top w:type="dxa" w:w="40"/>
-              <w:left w:type="dxa" w:w="90"/>
-              <w:bottom w:type="dxa" w:w="40"/>
-              <w:right w:type="dxa" w:w="90"/>
-            </w:tcMar>
-            <w:vAlign w:val="top"/>
-          </w:tcPr>
+          </w:p>
           <w:p>
             <w:pPr>
               <w:pStyle w:val="ListParagraph"/>
@@ -4970,9 +5424,66 @@
                 <w:sz w:val="19"/>
                 <w:szCs w:val="19"/>
               </w:rPr>
-              <w:t xml:space="preserve">Non-restoring division failed for large divisors → widened the A register to n + 2 bits; all 8-bit cases verified.</w:t>
-            </w:r>
-          </w:p>
+              <w:t xml:space="preserve">Class notes and PPTs (Units 2 and 3) · Reference textbooks · Report I</w:t>
+            </w:r>
+          </w:p>
+        </w:tc>
+      </w:tr>
+      <w:tr>
+        <w:trPr>
+          <w:cantSplit/>
+        </w:trPr>
+        <w:tc>
+          <w:tcPr>
+            <w:tcW w:type="dxa" w:w="1900"/>
+            <w:tcBorders>
+              <w:top w:val="single" w:color="000000" w:sz="4"/>
+              <w:left w:val="single" w:color="000000" w:sz="4"/>
+              <w:bottom w:val="single" w:color="000000" w:sz="4"/>
+              <w:right w:val="single" w:color="000000" w:sz="4"/>
+            </w:tcBorders>
+            <w:tcMar>
+              <w:top w:type="dxa" w:w="40"/>
+              <w:left w:type="dxa" w:w="90"/>
+              <w:bottom w:type="dxa" w:w="40"/>
+              <w:right w:type="dxa" w:w="90"/>
+            </w:tcMar>
+            <w:vAlign w:val="top"/>
+          </w:tcPr>
+          <w:p>
+            <w:pPr>
+              <w:spacing w:after="30" w:before="0" w:line="235"/>
+              <w:jc w:val="left"/>
+            </w:pPr>
+            <w:r>
+              <w:rPr>
+                <w:rFonts w:ascii="Times New Roman" w:cs="Times New Roman" w:eastAsia="Times New Roman" w:hAnsi="Times New Roman"/>
+                <w:b/>
+                <w:bCs/>
+                <w:sz w:val="19"/>
+                <w:szCs w:val="19"/>
+              </w:rPr>
+              <w:t xml:space="preserve">10. Challenges &amp; Corrective Actions</w:t>
+            </w:r>
+          </w:p>
+        </w:tc>
+        <w:tc>
+          <w:tcPr>
+            <w:tcW w:type="dxa" w:w="8180"/>
+            <w:tcBorders>
+              <w:top w:val="single" w:color="000000" w:sz="4"/>
+              <w:left w:val="single" w:color="000000" w:sz="4"/>
+              <w:bottom w:val="single" w:color="000000" w:sz="4"/>
+              <w:right w:val="single" w:color="000000" w:sz="4"/>
+            </w:tcBorders>
+            <w:tcMar>
+              <w:top w:type="dxa" w:w="40"/>
+              <w:left w:type="dxa" w:w="90"/>
+              <w:bottom w:type="dxa" w:w="40"/>
+              <w:right w:type="dxa" w:w="90"/>
+            </w:tcMar>
+            <w:vAlign w:val="top"/>
+          </w:tcPr>
           <w:p>
             <w:pPr>
               <w:pStyle w:val="ListParagraph"/>
@@ -4989,53 +5500,12 @@
                 <w:sz w:val="19"/>
                 <w:szCs w:val="19"/>
               </w:rPr>
-              <w:t xml:space="preserve">Booth overflowed at −128 → limited inputs to ±127; every product in range verified.</w:t>
-            </w:r>
-          </w:p>
-          <w:p>
-            <w:pPr>
-              <w:pStyle w:val="ListParagraph"/>
-              <w:numPr>
-                <w:ilvl w:val="0"/>
-                <w:numId w:val="2"/>
-              </w:numPr>
-              <w:spacing w:after="20" w:line="235"/>
-              <w:jc w:val="both"/>
-            </w:pPr>
-            <w:r>
-              <w:rPr>
-                <w:rFonts w:ascii="Times New Roman" w:cs="Times New Roman" w:eastAsia="Times New Roman" w:hAnsi="Times New Roman"/>
-                <w:sz w:val="19"/>
-                <w:szCs w:val="19"/>
-              </w:rPr>
-              <w:t xml:space="preserve">FP rounding errors → exact significands with guard/round/sticky bits, compared with hardware.</w:t>
-            </w:r>
-          </w:p>
-          <w:p>
-            <w:pPr>
-              <w:pStyle w:val="ListParagraph"/>
-              <w:numPr>
-                <w:ilvl w:val="0"/>
-                <w:numId w:val="2"/>
-              </w:numPr>
-              <w:spacing w:after="20" w:line="235"/>
-              <w:jc w:val="both"/>
-            </w:pPr>
-            <w:r>
-              <w:rPr>
-                <w:rFonts w:ascii="Times New Roman" w:cs="Times New Roman" w:eastAsia="Times New Roman" w:hAnsi="Times New Roman"/>
-                <w:sz w:val="19"/>
-                <w:szCs w:val="19"/>
-              </w:rPr>
-              <w:t xml:space="preserve">Simulators too dense on phones → responsive layout with scrollable tables.</w:t>
+              <w:t xml:space="preserve">Non-restoring division failed for large divisors → A register widened to n + 2 bits. FP rounding errors → guard/round/sticky bits, checked against hardware. A dense first UI → redesigned as a simple list plus one Lab topic at a time.</w:t>
             </w:r>
           </w:p>
         </w:tc>
       </w:tr>
       <w:tr>
-        <w:trPr>
-          <w:cantSplit/>
-        </w:trPr>
         <w:tc>
           <w:tcPr>
             <w:tcW w:type="dxa" w:w="1900"/>
@@ -5100,9 +5570,9 @@
               </w:tblBorders>
             </w:tblPr>
             <w:tblGrid>
-              <w:gridCol w:w="2100"/>
-              <w:gridCol w:w="1600"/>
-              <w:gridCol w:w="4260"/>
+              <w:gridCol w:w="1900"/>
+              <w:gridCol w:w="1400"/>
+              <w:gridCol w:w="4660"/>
             </w:tblGrid>
             <w:tr>
               <w:trPr>
@@ -5110,7 +5580,7 @@
               </w:trPr>
               <w:tc>
                 <w:tcPr>
-                  <w:tcW w:type="dxa" w:w="2100"/>
+                  <w:tcW w:type="dxa" w:w="1900"/>
                   <w:tcBorders>
                     <w:top w:val="single" w:color="000000" w:sz="4"/>
                     <w:left w:val="single" w:color="000000" w:sz="4"/>
@@ -5145,7 +5615,7 @@
               </w:tc>
               <w:tc>
                 <w:tcPr>
-                  <w:tcW w:type="dxa" w:w="1600"/>
+                  <w:tcW w:type="dxa" w:w="1400"/>
                   <w:tcBorders>
                     <w:top w:val="single" w:color="000000" w:sz="4"/>
                     <w:left w:val="single" w:color="000000" w:sz="4"/>
@@ -5180,7 +5650,7 @@
               </w:tc>
               <w:tc>
                 <w:tcPr>
-                  <w:tcW w:type="dxa" w:w="4260"/>
+                  <w:tcW w:type="dxa" w:w="4660"/>
                   <w:tcBorders>
                     <w:top w:val="single" w:color="000000" w:sz="4"/>
                     <w:left w:val="single" w:color="000000" w:sz="4"/>
@@ -5220,7 +5690,7 @@
               </w:trPr>
               <w:tc>
                 <w:tcPr>
-                  <w:tcW w:type="dxa" w:w="2100"/>
+                  <w:tcW w:type="dxa" w:w="1900"/>
                   <w:tcBorders>
                     <w:top w:val="single" w:color="000000" w:sz="4"/>
                     <w:left w:val="single" w:color="000000" w:sz="4"/>
@@ -5254,7 +5724,7 @@
               </w:tc>
               <w:tc>
                 <w:tcPr>
-                  <w:tcW w:type="dxa" w:w="1600"/>
+                  <w:tcW w:type="dxa" w:w="1400"/>
                   <w:tcBorders>
                     <w:top w:val="single" w:color="000000" w:sz="4"/>
                     <w:left w:val="single" w:color="000000" w:sz="4"/>
@@ -5288,7 +5758,7 @@
               </w:tc>
               <w:tc>
                 <w:tcPr>
-                  <w:tcW w:type="dxa" w:w="4260"/>
+                  <w:tcW w:type="dxa" w:w="4660"/>
                   <w:tcBorders>
                     <w:top w:val="single" w:color="000000" w:sz="4"/>
                     <w:left w:val="single" w:color="000000" w:sz="4"/>
@@ -5316,7 +5786,7 @@
                       <w:sz w:val="18"/>
                       <w:szCs w:val="18"/>
                     </w:rPr>
-                    <w:t xml:space="preserve">PharmaCPU ISA, assembler, instruction-cycle simulator, integration, GitHub</w:t>
+                    <w:t xml:space="preserve">PharmaCPU ISA, assembler, instruction cycle, integration, GitHub</w:t>
                   </w:r>
                 </w:p>
               </w:tc>
@@ -5327,7 +5797,7 @@
               </w:trPr>
               <w:tc>
                 <w:tcPr>
-                  <w:tcW w:type="dxa" w:w="2100"/>
+                  <w:tcW w:type="dxa" w:w="1900"/>
                   <w:tcBorders>
                     <w:top w:val="single" w:color="000000" w:sz="4"/>
                     <w:left w:val="single" w:color="000000" w:sz="4"/>
@@ -5361,7 +5831,7 @@
               </w:tc>
               <w:tc>
                 <w:tcPr>
-                  <w:tcW w:type="dxa" w:w="1600"/>
+                  <w:tcW w:type="dxa" w:w="1400"/>
                   <w:tcBorders>
                     <w:top w:val="single" w:color="000000" w:sz="4"/>
                     <w:left w:val="single" w:color="000000" w:sz="4"/>
@@ -5395,7 +5865,7 @@
               </w:tc>
               <w:tc>
                 <w:tcPr>
-                  <w:tcW w:type="dxa" w:w="4260"/>
+                  <w:tcW w:type="dxa" w:w="4660"/>
                   <w:tcBorders>
                     <w:top w:val="single" w:color="000000" w:sz="4"/>
                     <w:left w:val="single" w:color="000000" w:sz="4"/>
@@ -5434,7 +5904,7 @@
               </w:trPr>
               <w:tc>
                 <w:tcPr>
-                  <w:tcW w:type="dxa" w:w="2100"/>
+                  <w:tcW w:type="dxa" w:w="1900"/>
                   <w:tcBorders>
                     <w:top w:val="single" w:color="000000" w:sz="4"/>
                     <w:left w:val="single" w:color="000000" w:sz="4"/>
@@ -5468,7 +5938,7 @@
               </w:tc>
               <w:tc>
                 <w:tcPr>
-                  <w:tcW w:type="dxa" w:w="1600"/>
+                  <w:tcW w:type="dxa" w:w="1400"/>
                   <w:tcBorders>
                     <w:top w:val="single" w:color="000000" w:sz="4"/>
                     <w:left w:val="single" w:color="000000" w:sz="4"/>
@@ -5502,7 +5972,7 @@
               </w:tc>
               <w:tc>
                 <w:tcPr>
-                  <w:tcW w:type="dxa" w:w="4260"/>
+                  <w:tcW w:type="dxa" w:w="4660"/>
                   <w:tcBorders>
                     <w:top w:val="single" w:color="000000" w:sz="4"/>
                     <w:left w:val="single" w:color="000000" w:sz="4"/>
@@ -5530,7 +6000,7 @@
                       <w:sz w:val="18"/>
                       <w:szCs w:val="18"/>
                     </w:rPr>
-                    <w:t xml:space="preserve">Restoring/non-restoring division, Booth, logic ops and status register</w:t>
+                    <w:t xml:space="preserve">Division, Booth’s algorithm, logic operations, status register</w:t>
                   </w:r>
                 </w:p>
               </w:tc>
@@ -5541,7 +6011,7 @@
               </w:trPr>
               <w:tc>
                 <w:tcPr>
-                  <w:tcW w:type="dxa" w:w="2100"/>
+                  <w:tcW w:type="dxa" w:w="1900"/>
                   <w:tcBorders>
                     <w:top w:val="single" w:color="000000" w:sz="4"/>
                     <w:left w:val="single" w:color="000000" w:sz="4"/>
@@ -5575,7 +6045,7 @@
               </w:tc>
               <w:tc>
                 <w:tcPr>
-                  <w:tcW w:type="dxa" w:w="1600"/>
+                  <w:tcW w:type="dxa" w:w="1400"/>
                   <w:tcBorders>
                     <w:top w:val="single" w:color="000000" w:sz="4"/>
                     <w:left w:val="single" w:color="000000" w:sz="4"/>
@@ -5609,7 +6079,7 @@
               </w:tc>
               <w:tc>
                 <w:tcPr>
-                  <w:tcW w:type="dxa" w:w="4260"/>
+                  <w:tcW w:type="dxa" w:w="4660"/>
                   <w:tcBorders>
                     <w:top w:val="single" w:color="000000" w:sz="4"/>
                     <w:left w:val="single" w:color="000000" w:sz="4"/>
@@ -5637,7 +6107,7 @@
                       <w:sz w:val="18"/>
                       <w:szCs w:val="18"/>
                     </w:rPr>
-                    <w:t xml:space="preserve">Pipelining, RISC vs CISC, Flynn’s classification, testing</w:t>
+                    <w:t xml:space="preserve">Pipelining, RISC vs CISC, Flynn’s taxonomy, testing</w:t>
                   </w:r>
                 </w:p>
               </w:tc>
@@ -5648,7 +6118,7 @@
               </w:trPr>
               <w:tc>
                 <w:tcPr>
-                  <w:tcW w:type="dxa" w:w="2100"/>
+                  <w:tcW w:type="dxa" w:w="1900"/>
                   <w:tcBorders>
                     <w:top w:val="single" w:color="000000" w:sz="4"/>
                     <w:left w:val="single" w:color="000000" w:sz="4"/>
@@ -5682,7 +6152,7 @@
               </w:tc>
               <w:tc>
                 <w:tcPr>
-                  <w:tcW w:type="dxa" w:w="1600"/>
+                  <w:tcW w:type="dxa" w:w="1400"/>
                   <w:tcBorders>
                     <w:top w:val="single" w:color="000000" w:sz="4"/>
                     <w:left w:val="single" w:color="000000" w:sz="4"/>
@@ -5716,7 +6186,7 @@
               </w:tc>
               <w:tc>
                 <w:tcPr>
-                  <w:tcW w:type="dxa" w:w="4260"/>
+                  <w:tcW w:type="dxa" w:w="4660"/>
                   <w:tcBorders>
                     <w:top w:val="single" w:color="000000" w:sz="4"/>
                     <w:left w:val="single" w:color="000000" w:sz="4"/>
@@ -5744,7 +6214,7 @@
                       <w:sz w:val="18"/>
                       <w:szCs w:val="18"/>
                     </w:rPr>
-                    <w:t xml:space="preserve">Inventory UI and dashboard, control-unit views, report compilation</w:t>
+                    <w:t xml:space="preserve">Stock view, control-design view, report compilation</w:t>
                   </w:r>
                 </w:p>
               </w:tc>

</xml_diff>